<commit_message>
feat: improve visual audit and examples
</commit_message>
<xml_diff>
--- a/examples/templates/branddocs_template.docx
+++ b/examples/templates/branddocs_template.docx
@@ -61,6 +61,85 @@
         <w:spacing w:before="60" w:after="180"/>
       </w:pPr>
     </w:p>
+    <w:tbl>
+      <w:tblPr>
+        <w:tblStyle w:val="BrandDocsTable"/>
+        <w:tblW w:type="auto" w:w="0"/>
+        <w:tblLayout w:type="fixed"/>
+        <w:tblLook w:firstColumn="1" w:firstRow="1" w:lastColumn="0" w:lastRow="0" w:noHBand="0" w:noVBand="1" w:val="04A0"/>
+        <w:tblLayout w:type="fixed"/>
+      </w:tblPr>
+      <w:tblGrid>
+        <w:gridCol w:w="2880"/>
+        <w:gridCol w:w="2880"/>
+        <w:gridCol w:w="2880"/>
+      </w:tblGrid>
+      <w:tr>
+        <w:tc>
+          <w:tcPr>
+            <w:tcW w:type="dxa" w:w="2160"/>
+          </w:tcPr>
+          <w:p>
+            <w:r>
+              <w:t>Brand health</w:t>
+            </w:r>
+          </w:p>
+        </w:tc>
+        <w:tc>
+          <w:tcPr>
+            <w:tcW w:type="dxa" w:w="2160"/>
+          </w:tcPr>
+          <w:p>
+            <w:r>
+              <w:t>Template coverage</w:t>
+            </w:r>
+          </w:p>
+        </w:tc>
+        <w:tc>
+          <w:tcPr>
+            <w:tcW w:type="dxa" w:w="2160"/>
+          </w:tcPr>
+          <w:p>
+            <w:r>
+              <w:t>Audit posture</w:t>
+            </w:r>
+          </w:p>
+        </w:tc>
+      </w:tr>
+      <w:tr>
+        <w:tc>
+          <w:tcPr>
+            <w:tcW w:type="dxa" w:w="2160"/>
+          </w:tcPr>
+          <w:p>
+            <w:r>
+              <w:t>92</w:t>
+            </w:r>
+          </w:p>
+        </w:tc>
+        <w:tc>
+          <w:tcPr>
+            <w:tcW w:type="dxa" w:w="2160"/>
+          </w:tcPr>
+          <w:p>
+            <w:r>
+              <w:t>3 formats</w:t>
+            </w:r>
+          </w:p>
+        </w:tc>
+        <w:tc>
+          <w:tcPr>
+            <w:tcW w:type="dxa" w:w="2160"/>
+          </w:tcPr>
+          <w:p>
+            <w:r>
+              <w:t>Deep QA</w:t>
+            </w:r>
+          </w:p>
+        </w:tc>
+      </w:tr>
+    </w:tbl>
+    <w:p/>
     <w:p>
       <w:pPr>
         <w:pStyle w:val="TOCHeading"/>
@@ -291,7 +370,33 @@
         <w:pStyle w:val="TableofFigures"/>
       </w:pPr>
       <w:r>
-        <w:t xml:space="preserve">Table 2. BrandDocs program rollout matrix</w:t>
+        <w:t xml:space="preserve">Table 2. BrandDocs risk and readiness matrix</w:t>
+      </w:r>
+      <w:r>
+        <w:tab/>
+      </w:r>
+      <w:r>
+        <w:fldChar w:fldCharType="begin"/>
+      </w:r>
+      <w:r>
+        <w:instrText xml:space="preserve"> PAGEREF _Toc0006 \h </w:instrText>
+      </w:r>
+      <w:r>
+        <w:fldChar w:fldCharType="separate"/>
+      </w:r>
+      <w:r>
+        <w:t xml:space="preserve">6</w:t>
+      </w:r>
+      <w:r>
+        <w:fldChar w:fldCharType="end"/>
+      </w:r>
+    </w:p>
+    <w:p>
+      <w:pPr>
+        <w:pStyle w:val="TableofFigures"/>
+      </w:pPr>
+      <w:r>
+        <w:t xml:space="preserve">Table 3. BrandDocs program rollout matrix</w:t>
       </w:r>
       <w:r>
         <w:tab/>
@@ -341,7 +446,7 @@
         <w:pStyle w:val="TableofFigures"/>
       </w:pPr>
       <w:r>
-        <w:t xml:space="preserve">Figure 1. BrandDocs Corp logo mark</w:t>
+        <w:t xml:space="preserve">Figure 1. BrandDocs Corp wordmark</w:t>
       </w:r>
       <w:r>
         <w:tab/>
@@ -744,7 +849,7 @@
         <w:pStyle w:val="Heading2"/>
       </w:pPr>
       <w:r>
-        <w:t>BrandDocs brand mark</w:t>
+        <w:t>BrandDocs wordmark</w:t>
       </w:r>
     </w:p>
     <w:p>
@@ -754,7 +859,7 @@
       <w:r>
         <w:drawing>
           <wp:inline distT="0" distB="0" distL="0" distR="0">
-            <wp:extent cx="1097280" cy="1097280"/>
+            <wp:extent cx="2743200" cy="685800"/>
             <wp:effectExtent l="0" t="0" r="0" b="0"/>
             <wp:docPr id="100" name="BrandDocsLogoFigure"/>
             <wp:cNvGraphicFramePr>
@@ -776,7 +881,7 @@
                   <ns4:spPr>
                     <ns3:xfrm>
                       <ns3:off x="0" y="0"/>
-                      <ns3:ext cx="1097280" cy="1097280"/>
+                      <ns3:ext cx="2743200" cy="685800"/>
                     </ns3:xfrm>
                     <ns3:prstGeom prst="rect">
                       <ns3:avLst/>
@@ -812,7 +917,7 @@
         <w:fldChar w:fldCharType="end"/>
       </w:r>
       <w:r>
-        <w:t xml:space="preserve">. BrandDocs Corp logo mark (synthetic).</w:t>
+        <w:t xml:space="preserve">. BrandDocs Corp wordmark (synthetic).</w:t>
       </w:r>
     </w:p>
     <w:p>
@@ -821,6 +926,279 @@
       </w:pPr>
       <w:r>
         <w:t>BrandDocs Corp is a synthetic, fictional company used to demonstrate an on-brand internal brief. All figures, names, and regions in this template are illustrative.</w:t>
+      </w:r>
+    </w:p>
+    <w:p>
+      <w:pPr>
+        <w:pStyle w:val="BrandDocsQuote"/>
+      </w:pPr>
+      <w:r>
+        <w:t>Design rule: preserve proven structure only while it improves the final artifact. If visual QA shows blank space, stale content, or broken flow, repair the composition rather than copying the template blindly.</w:t>
+      </w:r>
+    </w:p>
+    <w:p>
+      <w:pPr>
+        <w:pStyle w:val="Heading2"/>
+      </w:pPr>
+      <w:r>
+        <w:t>Readiness and risk matrix</w:t>
+      </w:r>
+    </w:p>
+    <w:p>
+      <w:r>
+        <w:t>The matrix below gives the template a realistic governance surface: it mixes status, owner, signal, and mitigation text in a branded table.</w:t>
+      </w:r>
+    </w:p>
+    <w:tbl>
+      <w:tblPr>
+        <w:tblStyle w:val="BrandDocsTable"/>
+        <w:tblW w:type="auto" w:w="0"/>
+        <w:tblLayout w:type="fixed"/>
+        <w:tblLook w:firstColumn="1" w:firstRow="1" w:lastColumn="0" w:lastRow="0" w:noHBand="0" w:noVBand="1" w:val="04A0"/>
+        <w:tblLook w:firstRow="1" w:lastRow="0" w:firstColumn="0" w:lastColumn="0" w:noHBand="0" w:noVBand="1"/>
+        <w:tblLayout w:type="fixed"/>
+      </w:tblPr>
+      <w:tblGrid>
+        <w:gridCol w:w="2160"/>
+        <w:gridCol w:w="2160"/>
+        <w:gridCol w:w="2160"/>
+        <w:gridCol w:w="2160"/>
+      </w:tblGrid>
+      <w:tr>
+        <w:tc>
+          <w:tcPr>
+            <w:tcW w:type="dxa" w:w="1980"/>
+          </w:tcPr>
+          <w:p>
+            <w:r>
+              <w:t>Area</w:t>
+            </w:r>
+          </w:p>
+        </w:tc>
+        <w:tc>
+          <w:tcPr>
+            <w:tcW w:type="dxa" w:w="1980"/>
+          </w:tcPr>
+          <w:p>
+            <w:r>
+              <w:t>Signal</w:t>
+            </w:r>
+          </w:p>
+        </w:tc>
+        <w:tc>
+          <w:tcPr>
+            <w:tcW w:type="dxa" w:w="1800"/>
+          </w:tcPr>
+          <w:p>
+            <w:r>
+              <w:t>Owner</w:t>
+            </w:r>
+          </w:p>
+        </w:tc>
+        <w:tc>
+          <w:tcPr>
+            <w:tcW w:type="dxa" w:w="3600"/>
+          </w:tcPr>
+          <w:p>
+            <w:r>
+              <w:t>Mitigation</w:t>
+            </w:r>
+          </w:p>
+        </w:tc>
+      </w:tr>
+      <w:tr>
+        <w:tc>
+          <w:tcPr>
+            <w:tcW w:type="dxa" w:w="1980"/>
+          </w:tcPr>
+          <w:p>
+            <w:r>
+              <w:t>Visual QA</w:t>
+            </w:r>
+          </w:p>
+        </w:tc>
+        <w:tc>
+          <w:tcPr>
+            <w:tcW w:type="dxa" w:w="1980"/>
+          </w:tcPr>
+          <w:p>
+            <w:r>
+              <w:t>Renderer drift</w:t>
+            </w:r>
+          </w:p>
+        </w:tc>
+        <w:tc>
+          <w:tcPr>
+            <w:tcW w:type="dxa" w:w="1800"/>
+          </w:tcPr>
+          <w:p>
+            <w:r>
+              <w:t>Platform</w:t>
+            </w:r>
+          </w:p>
+        </w:tc>
+        <w:tc>
+          <w:tcPr>
+            <w:tcW w:type="dxa" w:w="3600"/>
+          </w:tcPr>
+          <w:p>
+            <w:r>
+              <w:t>Smoke-test DOCX/PPTX/XLSX</w:t>
+            </w:r>
+          </w:p>
+        </w:tc>
+      </w:tr>
+      <w:tr>
+        <w:tc>
+          <w:tcPr>
+            <w:tcW w:type="dxa" w:w="1980"/>
+          </w:tcPr>
+          <w:p>
+            <w:r>
+              <w:t>Comprehension</w:t>
+            </w:r>
+          </w:p>
+        </w:tc>
+        <w:tc>
+          <w:tcPr>
+            <w:tcW w:type="dxa" w:w="1980"/>
+          </w:tcPr>
+          <w:p>
+            <w:r>
+              <w:t>Missing inventory</w:t>
+            </w:r>
+          </w:p>
+        </w:tc>
+        <w:tc>
+          <w:tcPr>
+            <w:tcW w:type="dxa" w:w="1800"/>
+          </w:tcPr>
+          <w:p>
+            <w:r>
+              <w:t>Model Ops</w:t>
+            </w:r>
+          </w:p>
+        </w:tc>
+        <w:tc>
+          <w:tcPr>
+            <w:tcW w:type="dxa" w:w="3600"/>
+          </w:tcPr>
+          <w:p>
+            <w:r>
+              <w:t>Fail closed on empty refs</w:t>
+            </w:r>
+          </w:p>
+        </w:tc>
+      </w:tr>
+      <w:tr>
+        <w:tc>
+          <w:tcPr>
+            <w:tcW w:type="dxa" w:w="1980"/>
+          </w:tcPr>
+          <w:p>
+            <w:r>
+              <w:t>Brand fidelity</w:t>
+            </w:r>
+          </w:p>
+        </w:tc>
+        <w:tc>
+          <w:tcPr>
+            <w:tcW w:type="dxa" w:w="1980"/>
+          </w:tcPr>
+          <w:p>
+            <w:r>
+              <w:t>Style fallback</w:t>
+            </w:r>
+          </w:p>
+        </w:tc>
+        <w:tc>
+          <w:tcPr>
+            <w:tcW w:type="dxa" w:w="1800"/>
+          </w:tcPr>
+          <w:p>
+            <w:r>
+              <w:t>Design</w:t>
+            </w:r>
+          </w:p>
+        </w:tc>
+        <w:tc>
+          <w:tcPr>
+            <w:tcW w:type="dxa" w:w="3600"/>
+          </w:tcPr>
+          <w:p>
+            <w:r>
+              <w:t>Re-assert captured styles</w:t>
+            </w:r>
+          </w:p>
+        </w:tc>
+      </w:tr>
+      <w:tr>
+        <w:tc>
+          <w:tcPr>
+            <w:tcW w:type="dxa" w:w="1980"/>
+          </w:tcPr>
+          <w:p>
+            <w:r>
+              <w:t>Delivery</w:t>
+            </w:r>
+          </w:p>
+        </w:tc>
+        <w:tc>
+          <w:tcPr>
+            <w:tcW w:type="dxa" w:w="1980"/>
+          </w:tcPr>
+          <w:p>
+            <w:r>
+              <w:t>Stale cache</w:t>
+            </w:r>
+          </w:p>
+        </w:tc>
+        <w:tc>
+          <w:tcPr>
+            <w:tcW w:type="dxa" w:w="1800"/>
+          </w:tcPr>
+          <w:p>
+            <w:r>
+              <w:t>Engineering</w:t>
+            </w:r>
+          </w:p>
+        </w:tc>
+        <w:tc>
+          <w:tcPr>
+            <w:tcW w:type="dxa" w:w="3600"/>
+          </w:tcPr>
+          <w:p>
+            <w:r>
+              <w:t>Refresh visible field results</w:t>
+            </w:r>
+          </w:p>
+        </w:tc>
+      </w:tr>
+    </w:tbl>
+    <w:p>
+      <w:pPr>
+        <w:pStyle w:val="Caption"/>
+      </w:pPr>
+      <w:r>
+        <w:t xml:space="preserve">Table </w:t>
+      </w:r>
+      <w:r>
+        <w:fldChar w:fldCharType="begin"/>
+      </w:r>
+      <w:r>
+        <w:instrText xml:space="preserve"> SEQ Table \* ARABIC </w:instrText>
+      </w:r>
+      <w:r>
+        <w:fldChar w:fldCharType="separate"/>
+      </w:r>
+      <w:r>
+        <w:t xml:space="preserve">1</w:t>
+      </w:r>
+      <w:r>
+        <w:fldChar w:fldCharType="end"/>
+      </w:r>
+      <w:r>
+        <w:t xml:space="preserve">. BrandDocs risk and readiness matrix (synthetic).</w:t>
       </w:r>
     </w:p>
     <w:p>
@@ -1471,7 +1849,7 @@
     <w:r>
       <w:drawing>
         <wp:inline distT="0" distB="0" distL="0" distR="0">
-          <wp:extent cx="360000" cy="360000"/>
+          <wp:extent cx="914400" cy="228600"/>
           <wp:effectExtent l="0" t="0" r="0" b="0"/>
           <wp:docPr id="200" name="BrandDocsHeaderLogo"/>
           <wp:cNvGraphicFramePr>
@@ -1493,7 +1871,7 @@
                 <ns4:spPr>
                   <ns3:xfrm>
                     <ns3:off x="0" y="0"/>
-                    <ns3:ext cx="360000" cy="360000"/>
+                    <ns3:ext cx="914400" cy="228600"/>
                   </ns3:xfrm>
                   <ns3:prstGeom prst="rect">
                     <ns3:avLst/>
@@ -13484,6 +13862,25 @@
     </w:pPr>
     <w:rPr>
       <w:color w:val="16213F"/>
+    </w:rPr>
+  </w:style>
+  <w:style w:type="paragraph" w:styleId="BrandDocsQuote" w:customStyle="1">
+    <w:name w:val="BrandDocs Quote"/>
+    <w:basedOn w:val="Normal"/>
+    <w:qFormat/>
+    <w:pPr>
+      <w:shd w:val="clear" w:color="auto" w:fill="DCE7FF"/>
+      <w:pBdr>
+        <w:top w:val="single" w:sz="12" w:space="6" w:color="16213F"/>
+        <w:left w:val="single" w:sz="24" w:space="6" w:color="E0742B"/>
+        <w:bottom w:val="single" w:sz="12" w:space="6" w:color="16213F"/>
+        <w:right w:val="single" w:sz="12" w:space="6" w:color="16213F"/>
+      </w:pBdr>
+      <w:spacing w:before="120" w:after="120"/>
+    </w:pPr>
+    <w:rPr>
+      <w:color w:val="16213F"/>
+      <w:sz w:val="24"/>
     </w:rPr>
   </w:style>
   <w:style w:type="paragraph" w:styleId="BrandDocsBulletL1" w:customStyle="1">

</xml_diff>